<commit_message>
fix: update Koneksi Santri classification from SaaS to integrated pesantren ERP platform
</commit_message>
<xml_diff>
--- a/public/cv/Ahmad-Ayub-Numan-Full-Stack-Software-Engineer-CV-EN.docx
+++ b/public/cv/Ahmad-Ayub-Numan-Full-Stack-Software-Engineer-CV-EN.docx
@@ -570,7 +570,7 @@
           <w:sz w:val="19"/>
           <w:szCs w:val="19"/>
         </w:rPr>
-        <w:t xml:space="preserve">Koneksi Santri — Islamic Boarding School Multi-Tenant ERP</w:t>
+        <w:t xml:space="preserve">Koneksi Santri — Integrated Islamic Boarding School ERP</w:t>
       </w:r>
     </w:p>
     <w:p>
@@ -636,7 +636,7 @@
           <w:sz w:val="17"/>
           <w:szCs w:val="17"/>
         </w:rPr>
-        <w:t xml:space="preserve">Engineered a multi-tenant SaaS ERP bridging student administration, guardian communications, automated tuition billing, and multi-branch double-entry general ledger accounting (PostgreSQL RLS).</w:t>
+        <w:t xml:space="preserve">Engineered an integrated ERP system bridging student administration, guardian communications, automated tuition billing, and multi-branch double-entry general ledger accounting.</w:t>
       </w:r>
     </w:p>
     <w:p>

</xml_diff>

<commit_message>
feat: include portfolio link in CV, refine full-stack track record, and add tailored CV generator
</commit_message>
<xml_diff>
--- a/public/cv/Ahmad-Ayub-Numan-Full-Stack-Software-Engineer-CV-EN.docx
+++ b/public/cv/Ahmad-Ayub-Numan-Full-Stack-Software-Engineer-CV-EN.docx
@@ -89,7 +89,14 @@
           <w:sz w:val="17"/>
           <w:szCs w:val="17"/>
         </w:rPr>
-        <w:t xml:space="preserve">github.com/ayebe51</w:t>
+        <w:t xml:space="preserve">github.com/ayebe51  •  </w:t>
+      </w:r>
+      <w:r>
+        <w:rPr>
+          <w:sz w:val="17"/>
+          <w:szCs w:val="17"/>
+        </w:rPr>
+        <w:t xml:space="preserve">portfolio-seven-theta-bovx80a70x.vercel.app</w:t>
       </w:r>
     </w:p>
     <w:p>

</xml_diff>

<commit_message>
fix: remove expired SIMMACI demo link and update project links across portfolio and CVs
</commit_message>
<xml_diff>
--- a/public/cv/Ahmad-Ayub-Numan-Full-Stack-Software-Engineer-CV-EN.docx
+++ b/public/cv/Ahmad-Ayub-Numan-Full-Stack-Software-Engineer-CV-EN.docx
@@ -524,7 +524,7 @@
           <w:sz w:val="16"/>
           <w:szCs w:val="16"/>
         </w:rPr>
-        <w:t xml:space="preserve">Live Demo: sim-maarif-fullstack.vercel.app  |  Repository: github.com/ayebe51/simmaci</w:t>
+        <w:t xml:space="preserve">Repository: github.com/ayebe51/simmaci</w:t>
       </w:r>
     </w:p>
     <w:p>
@@ -605,7 +605,23 @@
           <w:sz w:val="16"/>
           <w:szCs w:val="16"/>
         </w:rPr>
-        <w:t xml:space="preserve">Live Demo: admin.koneksisantri.tech  |  Repository: github.com/ayebe51/koneksi-santri</w:t>
+        <w:t xml:space="preserve">Live Demo: admin.koneksisantri.tech</w:t>
+      </w:r>
+      <w:r>
+        <w:rPr>
+          <w:color w:val="718096"/>
+          <w:sz w:val="16"/>
+          <w:szCs w:val="16"/>
+        </w:rPr>
+        <w:t xml:space="preserve">  |  </w:t>
+      </w:r>
+      <w:r>
+        <w:rPr>
+          <w:color w:val="2B6CB0"/>
+          <w:sz w:val="16"/>
+          <w:szCs w:val="16"/>
+        </w:rPr>
+        <w:t xml:space="preserve">Repository: github.com/ayebe51/koneksi-santri</w:t>
       </w:r>
     </w:p>
     <w:p>
@@ -705,7 +721,23 @@
           <w:sz w:val="16"/>
           <w:szCs w:val="16"/>
         </w:rPr>
-        <w:t xml:space="preserve">Live Demo: inventory-pos-hazel.vercel.app  |  Repository: github.com/ayebe51/inventory-pos</w:t>
+        <w:t xml:space="preserve">Live Demo: inventory-pos-hazel.vercel.app</w:t>
+      </w:r>
+      <w:r>
+        <w:rPr>
+          <w:color w:val="718096"/>
+          <w:sz w:val="16"/>
+          <w:szCs w:val="16"/>
+        </w:rPr>
+        <w:t xml:space="preserve">  |  </w:t>
+      </w:r>
+      <w:r>
+        <w:rPr>
+          <w:color w:val="2B6CB0"/>
+          <w:sz w:val="16"/>
+          <w:szCs w:val="16"/>
+        </w:rPr>
+        <w:t xml:space="preserve">Repository: github.com/ayebe51/inventory-pos</w:t>
       </w:r>
     </w:p>
     <w:p>

</xml_diff>

<commit_message>
feat: highlight Flutter mobile app (Portal Wali Santri) across Koneksi Santri, skills, and CVs
</commit_message>
<xml_diff>
--- a/public/cv/Ahmad-Ayub-Numan-Full-Stack-Software-Engineer-CV-EN.docx
+++ b/public/cv/Ahmad-Ayub-Numan-Full-Stack-Software-Engineer-CV-EN.docx
@@ -168,7 +168,7 @@
           <w:sz w:val="17"/>
           <w:szCs w:val="17"/>
         </w:rPr>
-        <w:t xml:space="preserve">TypeScript, JavaScript, PHP 8+, SQL, HTML5, CSS3</w:t>
+        <w:t xml:space="preserve">TypeScript, JavaScript, Dart, PHP 8+, SQL, HTML5, CSS3</w:t>
       </w:r>
     </w:p>
     <w:p>
@@ -191,7 +191,7 @@
           <w:sz w:val="17"/>
           <w:szCs w:val="17"/>
         </w:rPr>
-        <w:t xml:space="preserve">React 18/19, Next.js (App Router), Tailwind CSS, Blade, Zustand, Framer Motion, Shadcn UI</w:t>
+        <w:t xml:space="preserve">React 18/19, Next.js (App Router), Flutter, Tailwind CSS, Blade, Zustand, Framer Motion, Shadcn UI</w:t>
       </w:r>
     </w:p>
     <w:p>
@@ -577,7 +577,7 @@
           <w:sz w:val="19"/>
           <w:szCs w:val="19"/>
         </w:rPr>
-        <w:t xml:space="preserve">Koneksi Santri — Integrated Islamic Boarding School ERP</w:t>
+        <w:t xml:space="preserve">Koneksi Santri — Integrated Islamic Boarding School ERP &amp; Mobile App</w:t>
       </w:r>
     </w:p>
     <w:p>
@@ -592,7 +592,7 @@
           <w:sz w:val="16"/>
           <w:szCs w:val="16"/>
         </w:rPr>
-        <w:t xml:space="preserve">Tech Stack: Next.js 14, TypeScript, NestJS, PostgreSQL, Prisma ORM, Closed-Loop Wallet, Docker</w:t>
+        <w:t xml:space="preserve">Tech Stack: Next.js 14, Flutter (Dart), NestJS, TypeScript, PostgreSQL, Prisma ORM, Docker</w:t>
       </w:r>
     </w:p>
     <w:p>
@@ -640,7 +640,7 @@
           <w:sz w:val="17"/>
           <w:szCs w:val="17"/>
         </w:rPr>
-        <w:t xml:space="preserve">Architected a closed-loop digital wallet system for cashless on-campus merchant &amp; canteen spending, featuring parent-controlled daily spending caps and instant balance ledgers.</w:t>
+        <w:t xml:space="preserve">Engineered a dedicated Flutter mobile application for guardians (Portal Wali Santri) to monitor real-time canteen spending, manage closed-loop daily limits, and receive smart gate pickup alerts.</w:t>
       </w:r>
     </w:p>
     <w:p>
@@ -659,7 +659,7 @@
           <w:sz w:val="17"/>
           <w:szCs w:val="17"/>
         </w:rPr>
-        <w:t xml:space="preserve">Engineered an integrated ERP system bridging student administration, guardian communications, automated tuition billing, and multi-branch double-entry general ledger accounting.</w:t>
+        <w:t xml:space="preserve">Architected an integrated web &amp; mobile ERP bridging student administration, QR-code Smart Gate security checkouts, automated tuition billing, and multi-branch general ledger accounting.</w:t>
       </w:r>
     </w:p>
     <w:p>
@@ -678,7 +678,7 @@
           <w:sz w:val="17"/>
           <w:szCs w:val="17"/>
         </w:rPr>
-        <w:t xml:space="preserve">Designed QR-code Smart Gate security checkpoint logging integrated with automated WhatsApp notification dispatches for verified student pickups.</w:t>
+        <w:t xml:space="preserve">Designed a closed-loop digital wallet system with instant balance ledgers, fraud-proof transaction verification, and automated WhatsApp notification dispatch.</w:t>
       </w:r>
     </w:p>
     <w:p>

</xml_diff>

<commit_message>
feat(cv): integrate Dicoding Spec-Driven Development certification across ATS CVs and portfolio modal
</commit_message>
<xml_diff>
--- a/public/cv/Ahmad-Ayub-Numan-Full-Stack-Software-Engineer-CV-EN.docx
+++ b/public/cv/Ahmad-Ayub-Numan-Full-Stack-Software-Engineer-CV-EN.docx
@@ -283,7 +283,7 @@
           <w:sz w:val="17"/>
           <w:szCs w:val="17"/>
         </w:rPr>
-        <w:t xml:space="preserve">Domain-Driven Design (DDD), Segregation of Duties (Maker-Checker), Closed-Loop Wallets, State Machines, Automated Testing (PHPUnit, Pest, Jest), DevSecOps</w:t>
+        <w:t xml:space="preserve">Spec-Driven Development (SDD), Domain-Driven Design (DDD), Segregation of Duties (Maker-Checker), Closed-Loop Wallets, State Machines, Automated Testing (PHPUnit, Pest, Jest), DevSecOps</w:t>
       </w:r>
     </w:p>
     <w:p>
@@ -832,6 +832,71 @@
           <w:szCs w:val="17"/>
         </w:rPr>
         <w:t xml:space="preserve">STAI At-Tahdzib Jombang • Jombang, East Java, Indonesia</w:t>
+      </w:r>
+    </w:p>
+    <w:p>
+      <w:pPr>
+        <w:pBdr>
+          <w:bottom w:val="single" w:color="CBD5E0" w:sz="6" w:space="3"/>
+        </w:pBdr>
+        <w:spacing w:after="70" w:before="130"/>
+      </w:pPr>
+      <w:r>
+        <w:rPr>
+          <w:b/>
+          <w:bCs/>
+          <w:color w:val="1A202C"/>
+          <w:sz w:val="20"/>
+          <w:szCs w:val="20"/>
+        </w:rPr>
+        <w:t xml:space="preserve">CERTIFICATIONS &amp; CREDENTIALS</w:t>
+      </w:r>
+    </w:p>
+    <w:p>
+      <w:pPr>
+        <w:spacing w:after="15" w:before="70"/>
+      </w:pPr>
+      <w:r>
+        <w:rPr>
+          <w:b/>
+          <w:bCs/>
+          <w:color w:val="1A202C"/>
+          <w:sz w:val="19"/>
+          <w:szCs w:val="19"/>
+        </w:rPr>
+        <w:t xml:space="preserve">Spec-Driven Development dengan Kiro</w:t>
+      </w:r>
+      <w:r>
+        <w:rPr>
+          <w:color w:val="4A5568"/>
+          <w:sz w:val="17"/>
+          <w:szCs w:val="17"/>
+        </w:rPr>
+        <w:t xml:space="preserve">	April 2026 – April 2029</w:t>
+      </w:r>
+    </w:p>
+    <w:p>
+      <w:pPr>
+        <w:spacing w:after="35"/>
+      </w:pPr>
+      <w:r>
+        <w:rPr>
+          <w:i/>
+          <w:iCs/>
+          <w:color w:val="4A5568"/>
+          <w:sz w:val="17"/>
+          <w:szCs w:val="17"/>
+        </w:rPr>
+        <w:t xml:space="preserve">Dicoding Indonesia (Dicoding Academy) • Credential ID: EYX4Q03J6PDL</w:t>
+      </w:r>
+      <w:r>
+        <w:rPr>
+          <w:color w:val="2B6CB0"/>
+          <w:sz w:val="16"/>
+          <w:szCs w:val="16"/>
+          <w:u w:val="single"/>
+        </w:rPr>
+        <w:t xml:space="preserve"> • https://www.dicoding.com/certificates/EYX4Q03J6PDL</w:t>
       </w:r>
     </w:p>
     <w:sectPr>

</xml_diff>

<commit_message>
feat(cv): upgrade experience title to Full-Stack Software Engineer across portfolio and CVs
</commit_message>
<xml_diff>
--- a/public/cv/Ahmad-Ayub-Numan-Full-Stack-Software-Engineer-CV-EN.docx
+++ b/public/cv/Ahmad-Ayub-Numan-Full-Stack-Software-Engineer-CV-EN.docx
@@ -316,15 +316,15 @@
           <w:sz w:val="19"/>
           <w:szCs w:val="19"/>
         </w:rPr>
-        <w:t xml:space="preserve">Staff IT &amp; Sistem Informasi </w:t>
-      </w:r>
-      <w:r>
-        <w:rPr>
-          <w:color w:val="4A5568"/>
-          <w:sz w:val="17"/>
-          <w:szCs w:val="17"/>
-        </w:rPr>
-        <w:t xml:space="preserve">(Lead Full-Stack Systems Engineer &amp; Product Owner)</w:t>
+        <w:t xml:space="preserve">Full-Stack Software Engineer </w:t>
+      </w:r>
+      <w:r>
+        <w:rPr>
+          <w:color w:val="4A5568"/>
+          <w:sz w:val="17"/>
+          <w:szCs w:val="17"/>
+        </w:rPr>
+        <w:t xml:space="preserve">(Lead Systems Architect &amp; Product Lead)</w:t>
       </w:r>
       <w:r>
         <w:rPr>

</xml_diff>